<commit_message>
feat(finance): update terminology to Tithe/Unsupo/Mutulo and Sunday Collection, isolate parish funds, and implement 8 Annual Special Diocesan Collections
</commit_message>
<xml_diff>
--- a/data/templates/diocesan_financial_template.docx
+++ b/data/templates/diocesan_financial_template.docx
@@ -1304,7 +1304,7 @@
                 <w:rFonts w:ascii="Times New Roman" w:eastAsia="Times New Roman" w:hAnsi="Times New Roman" w:cs="Times New Roman"/>
                 <w:lang w:eastAsia="en-ZW"/>
               </w:rPr>
-              <w:t>Pledges (</w:t>
+              <w:t>Tithe/Unsupo/Mutulo</w:t>
             </w:r>
             <w:proofErr w:type="spellStart"/>
             <w:r>
@@ -1312,7 +1312,7 @@
                 <w:rFonts w:ascii="Times New Roman" w:eastAsia="Times New Roman" w:hAnsi="Times New Roman" w:cs="Times New Roman"/>
                 <w:lang w:eastAsia="en-ZW"/>
               </w:rPr>
-              <w:t>isondlo</w:t>
+              <w:t/>
             </w:r>
             <w:proofErr w:type="spellEnd"/>
             <w:r>
@@ -1320,7 +1320,7 @@
                 <w:rFonts w:ascii="Times New Roman" w:eastAsia="Times New Roman" w:hAnsi="Times New Roman" w:cs="Times New Roman"/>
                 <w:lang w:eastAsia="en-ZW"/>
               </w:rPr>
-              <w:t>)</w:t>
+              <w:t/>
             </w:r>
           </w:p>
         </w:tc>
@@ -1480,7 +1480,7 @@
                 <w:rFonts w:ascii="Times New Roman" w:eastAsia="Times New Roman" w:hAnsi="Times New Roman" w:cs="Times New Roman"/>
                 <w:lang w:eastAsia="en-ZW"/>
               </w:rPr>
-              <w:t>Collection (</w:t>
+              <w:t>Sunday Collection</w:t>
             </w:r>
             <w:proofErr w:type="spellStart"/>
             <w:r>
@@ -1488,7 +1488,7 @@
                 <w:rFonts w:ascii="Times New Roman" w:eastAsia="Times New Roman" w:hAnsi="Times New Roman" w:cs="Times New Roman"/>
                 <w:lang w:eastAsia="en-ZW"/>
               </w:rPr>
-              <w:t>umnikelo</w:t>
+              <w:t/>
             </w:r>
             <w:proofErr w:type="spellEnd"/>
             <w:r>
@@ -1496,7 +1496,7 @@
                 <w:rFonts w:ascii="Times New Roman" w:eastAsia="Times New Roman" w:hAnsi="Times New Roman" w:cs="Times New Roman"/>
                 <w:lang w:eastAsia="en-ZW"/>
               </w:rPr>
-              <w:t>)</w:t>
+              <w:t/>
             </w:r>
           </w:p>
         </w:tc>

</xml_diff>